<commit_message>
SEHHACA-218: cv: updated date
</commit_message>
<xml_diff>
--- a/assets/doc/abrar_mudhir_cv.docx
+++ b/assets/doc/abrar_mudhir_cv.docx
@@ -189,7 +189,7 @@
           <w:sz w:val="20"/>
           <w:lang w:val="en-GB" w:eastAsia="en-GB"/>
         </w:rPr>
-        <w:pict w14:anchorId="106921E6">
+        <w:pict w14:anchorId="2EF36C3A">
           <v:group id="_x0000_s2107" style="position:absolute;margin-left:7.05pt;margin-top:12.05pt;width:138.75pt;height:16.5pt;z-index:-5" coordorigin="1342,3892" coordsize="2700,180" o:allowincell="f">
             <v:rect id="_x0000_s2108" style="position:absolute;left:1342;top:3892;width:2700;height:180" fillcolor="#31849b" stroked="f">
               <v:fill opacity="59638f"/>
@@ -468,7 +468,7 @@
           <w:szCs w:val="16"/>
           <w:lang w:val="en-GB"/>
         </w:rPr>
-        <w:t>31</w:t>
+        <w:t>01</w:t>
       </w:r>
       <w:r>
         <w:rPr>
@@ -492,7 +492,7 @@
           <w:szCs w:val="16"/>
           <w:lang w:val="en-GB"/>
         </w:rPr>
-        <w:t>Aug</w:t>
+        <w:t>Sep</w:t>
       </w:r>
       <w:r>
         <w:rPr>
@@ -648,7 +648,7 @@
           <w:sz w:val="20"/>
           <w:lang w:val="en-GB"/>
         </w:rPr>
-        <w:pict w14:anchorId="2C463179">
+        <w:pict w14:anchorId="4B8BC2CA">
           <v:group id="_x0000_s2269" style="position:absolute;margin-left:6.8pt;margin-top:120.8pt;width:142.2pt;height:16.5pt;z-index:-1" coordorigin="1342,3892" coordsize="2700,180" o:allowincell="f">
             <v:rect id="_x0000_s2270" style="position:absolute;left:1342;top:3892;width:2700;height:180" fillcolor="#31849b" stroked="f">
               <v:fill opacity="59638f"/>
@@ -667,7 +667,7 @@
           <w:sz w:val="20"/>
           <w:lang w:val="en-GB"/>
         </w:rPr>
-        <w:pict w14:anchorId="1BE4BC49">
+        <w:pict w14:anchorId="4BBC916E">
           <v:group id="_x0000_s2212" style="position:absolute;margin-left:6.8pt;margin-top:12.45pt;width:142.2pt;height:16.5pt;z-index:-4" coordorigin="1342,3892" coordsize="2700,180" o:allowincell="f">
             <v:rect id="_x0000_s2213" style="position:absolute;left:1342;top:3892;width:2700;height:180" fillcolor="#31849b" stroked="f">
               <v:fill opacity="59638f"/>
@@ -914,6 +914,7 @@
                 <w:lang w:val="en-GB"/>
               </w:rPr>
             </w:pPr>
+            <w:proofErr w:type="gramStart"/>
             <w:r>
               <w:rPr>
                 <w:rFonts w:ascii="Verdana" w:hAnsi="Verdana" w:cs="Arial"/>
@@ -924,7 +925,20 @@
                 <w:sz w:val="20"/>
                 <w:lang w:val="en-GB"/>
               </w:rPr>
-              <w:t xml:space="preserve">Masters of Engineering - </w:t>
+              <w:t>Masters of Engineering</w:t>
+            </w:r>
+            <w:proofErr w:type="gramEnd"/>
+            <w:r>
+              <w:rPr>
+                <w:rFonts w:ascii="Verdana" w:hAnsi="Verdana" w:cs="Arial"/>
+                <w:b/>
+                <w:bCs/>
+                <w:i/>
+                <w:color w:val="595959"/>
+                <w:sz w:val="20"/>
+                <w:lang w:val="en-GB"/>
+              </w:rPr>
+              <w:t xml:space="preserve"> - </w:t>
             </w:r>
             <w:r>
               <w:rPr>
@@ -1417,17 +1431,54 @@
               </w:rPr>
               <w:t xml:space="preserve"> (</w:t>
             </w:r>
-            <w:hyperlink r:id="rId12" w:history="1">
-              <w:r>
-                <w:rPr>
-                  <w:rStyle w:val="Hyperlink"/>
-                  <w:rFonts w:ascii="Verdana" w:hAnsi="Verdana" w:cs="Verdana"/>
-                  <w:sz w:val="20"/>
-                  <w:lang w:val="it-IT" w:eastAsia="ar-SA"/>
-                </w:rPr>
-                <w:t>AI-102</w:t>
-              </w:r>
-            </w:hyperlink>
+            <w:r>
+              <w:rPr>
+                <w:rFonts w:ascii="Verdana" w:hAnsi="Verdana" w:cs="Verdana"/>
+                <w:sz w:val="20"/>
+                <w:lang w:val="en-GB" w:eastAsia="ar-SA"/>
+              </w:rPr>
+              <w:fldChar w:fldCharType="begin"/>
+            </w:r>
+            <w:r>
+              <w:rPr>
+                <w:rFonts w:ascii="Verdana" w:hAnsi="Verdana" w:cs="Verdana"/>
+                <w:sz w:val="20"/>
+                <w:lang w:val="it-IT" w:eastAsia="ar-SA"/>
+              </w:rPr>
+              <w:instrText>HYPERLINK "https://learn.microsoft.com/api/credentials/share/en-gb/AbrarMudhir-6026/D34862B3E92762BE?sharingId=6CDE1921338520C9"</w:instrText>
+            </w:r>
+            <w:r>
+              <w:rPr>
+                <w:rFonts w:ascii="Verdana" w:hAnsi="Verdana" w:cs="Verdana"/>
+                <w:sz w:val="20"/>
+                <w:lang w:val="en-GB" w:eastAsia="ar-SA"/>
+              </w:rPr>
+            </w:r>
+            <w:r>
+              <w:rPr>
+                <w:rFonts w:ascii="Verdana" w:hAnsi="Verdana" w:cs="Verdana"/>
+                <w:sz w:val="20"/>
+                <w:lang w:val="en-GB" w:eastAsia="ar-SA"/>
+              </w:rPr>
+              <w:fldChar w:fldCharType="separate"/>
+            </w:r>
+            <w:r>
+              <w:rPr>
+                <w:rStyle w:val="Hyperlink"/>
+                <w:rFonts w:ascii="Verdana" w:hAnsi="Verdana" w:cs="Verdana"/>
+                <w:sz w:val="20"/>
+                <w:lang w:val="it-IT" w:eastAsia="ar-SA"/>
+              </w:rPr>
+              <w:t>AI-102</w:t>
+            </w:r>
+            <w:r>
+              <w:rPr>
+                <w:rFonts w:ascii="Verdana" w:hAnsi="Verdana" w:cs="Verdana"/>
+                <w:sz w:val="20"/>
+                <w:lang w:val="en-GB" w:eastAsia="ar-SA"/>
+              </w:rPr>
+              <w:fldChar w:fldCharType="end"/>
+            </w:r>
             <w:r>
               <w:rPr>
                 <w:rFonts w:ascii="Verdana" w:hAnsi="Verdana" w:cs="Verdana"/>
@@ -1576,7 +1627,7 @@
               </w:rPr>
               <w:t xml:space="preserve"> (</w:t>
             </w:r>
-            <w:hyperlink r:id="rId13" w:history="1">
+            <w:hyperlink r:id="rId12" w:history="1">
               <w:r>
                 <w:rPr>
                   <w:rStyle w:val="Hyperlink"/>
@@ -1648,7 +1699,7 @@
               </w:rPr>
               <w:t xml:space="preserve"> (</w:t>
             </w:r>
-            <w:hyperlink r:id="rId14" w:history="1">
+            <w:hyperlink r:id="rId13" w:history="1">
               <w:r>
                 <w:rPr>
                   <w:rStyle w:val="Hyperlink"/>
@@ -1724,7 +1775,7 @@
               </w:rPr>
               <w:t xml:space="preserve"> (</w:t>
             </w:r>
-            <w:hyperlink r:id="rId15" w:history="1">
+            <w:hyperlink r:id="rId14" w:history="1">
               <w:r>
                 <w:rPr>
                   <w:rStyle w:val="Hyperlink"/>
@@ -1798,7 +1849,7 @@
                 <w:sz w:val="20"/>
                 <w:lang w:val="en-GB" w:eastAsia="ar-SA"/>
               </w:rPr>
-              <w:pict w14:anchorId="31180161">
+              <w:pict w14:anchorId="1C23FED5">
                 <v:group id="_x0000_s2263" style="position:absolute;margin-left:7.5pt;margin-top:11.85pt;width:142.2pt;height:16.5pt;z-index:-2;mso-position-horizontal-relative:text;mso-position-vertical-relative:text" coordorigin="1342,3892" coordsize="2700,180" o:allowincell="f">
                   <v:rect id="_x0000_s2264" style="position:absolute;left:1342;top:3892;width:2700;height:180" fillcolor="#31849b" stroked="f">
                     <v:fill opacity="59638f"/>
@@ -1952,7 +2003,7 @@
                 <w:lang w:val="en-GB"/>
               </w:rPr>
             </w:pPr>
-            <w:hyperlink r:id="rId16" w:history="1">
+            <w:hyperlink r:id="rId15" w:history="1">
               <w:r>
                 <w:rPr>
                   <w:rStyle w:val="Hyperlink"/>
@@ -2777,7 +2828,7 @@
                 <w:lang w:val="en-GB"/>
               </w:rPr>
             </w:pPr>
-            <w:hyperlink r:id="rId17" w:history="1">
+            <w:hyperlink r:id="rId16" w:history="1">
               <w:r>
                 <w:rPr>
                   <w:rStyle w:val="Hyperlink"/>
@@ -2944,7 +2995,25 @@
                 <w:sz w:val="20"/>
                 <w:lang w:val="en-GB" w:eastAsia="ar-SA"/>
               </w:rPr>
-              <w:t xml:space="preserve"> and Dagster, creating scalable data products that support EDFT’s trading </w:t>
+              <w:t xml:space="preserve"> and </w:t>
+            </w:r>
+            <w:proofErr w:type="spellStart"/>
+            <w:r>
+              <w:rPr>
+                <w:rFonts w:ascii="Verdana" w:hAnsi="Verdana" w:cs="Verdana"/>
+                <w:sz w:val="20"/>
+                <w:lang w:val="en-GB" w:eastAsia="ar-SA"/>
+              </w:rPr>
+              <w:t>Dagster</w:t>
+            </w:r>
+            <w:proofErr w:type="spellEnd"/>
+            <w:r>
+              <w:rPr>
+                <w:rFonts w:ascii="Verdana" w:hAnsi="Verdana" w:cs="Verdana"/>
+                <w:sz w:val="20"/>
+                <w:lang w:val="en-GB" w:eastAsia="ar-SA"/>
+              </w:rPr>
+              <w:t xml:space="preserve">, creating scalable data products that support EDFT’s trading </w:t>
             </w:r>
             <w:r>
               <w:rPr>
@@ -3185,6 +3254,7 @@
               </w:rPr>
               <w:t>(</w:t>
             </w:r>
+            <w:proofErr w:type="spellStart"/>
             <w:r>
               <w:rPr>
                 <w:rFonts w:ascii="Verdana" w:hAnsi="Verdana" w:cs="Arial"/>
@@ -3195,6 +3265,7 @@
               </w:rPr>
               <w:t>Dagster</w:t>
             </w:r>
+            <w:proofErr w:type="spellEnd"/>
             <w:r>
               <w:rPr>
                 <w:rFonts w:ascii="Verdana" w:hAnsi="Verdana" w:cs="Arial"/>
@@ -3596,7 +3667,7 @@
                 <w:lang w:val="en-GB"/>
               </w:rPr>
             </w:pPr>
-            <w:hyperlink r:id="rId18" w:history="1">
+            <w:hyperlink r:id="rId17" w:history="1">
               <w:r>
                 <w:rPr>
                   <w:rStyle w:val="Hyperlink"/>
@@ -3798,7 +3869,25 @@
                 <w:sz w:val="20"/>
                 <w:lang w:val="en-GB" w:eastAsia="ar-SA"/>
               </w:rPr>
-              <w:t>Built a full-stack Fund Model application with a FastAPI backend and Dash frontend, replacing ~20 Excel-based models with a unified Python solution for carry calculations and forecasting.</w:t>
+              <w:t xml:space="preserve">Built a full-stack Fund Model application with a </w:t>
+            </w:r>
+            <w:proofErr w:type="spellStart"/>
+            <w:r>
+              <w:rPr>
+                <w:rFonts w:ascii="Verdana" w:hAnsi="Verdana" w:cs="Verdana"/>
+                <w:sz w:val="20"/>
+                <w:lang w:val="en-GB" w:eastAsia="ar-SA"/>
+              </w:rPr>
+              <w:t>FastAPI</w:t>
+            </w:r>
+            <w:proofErr w:type="spellEnd"/>
+            <w:r>
+              <w:rPr>
+                <w:rFonts w:ascii="Verdana" w:hAnsi="Verdana" w:cs="Verdana"/>
+                <w:sz w:val="20"/>
+                <w:lang w:val="en-GB" w:eastAsia="ar-SA"/>
+              </w:rPr>
+              <w:t xml:space="preserve"> backend and Dash frontend, replacing ~20 Excel-based models with a unified Python solution for carry calculations and forecasting.</w:t>
             </w:r>
           </w:p>
           <w:p>
@@ -4319,7 +4408,7 @@
                 <w:lang w:val="en-GB"/>
               </w:rPr>
             </w:pPr>
-            <w:hyperlink r:id="rId19" w:history="1">
+            <w:hyperlink r:id="rId18" w:history="1">
               <w:r>
                 <w:rPr>
                   <w:rStyle w:val="Hyperlink"/>
@@ -5311,7 +5400,7 @@
                 <w:lang w:val="en-GB"/>
               </w:rPr>
             </w:pPr>
-            <w:hyperlink r:id="rId20" w:history="1">
+            <w:hyperlink r:id="rId19" w:history="1">
               <w:r>
                 <w:rPr>
                   <w:rStyle w:val="Hyperlink"/>
@@ -6408,7 +6497,7 @@
                 <w:lang w:val="en-GB"/>
               </w:rPr>
             </w:pPr>
-            <w:hyperlink r:id="rId21" w:history="1">
+            <w:hyperlink r:id="rId20" w:history="1">
               <w:r>
                 <w:rPr>
                   <w:rStyle w:val="Hyperlink"/>
@@ -6429,7 +6518,7 @@
               </w:rPr>
               <w:t xml:space="preserve"> for ESA - </w:t>
             </w:r>
-            <w:hyperlink r:id="rId22" w:history="1">
+            <w:hyperlink r:id="rId21" w:history="1">
               <w:r>
                 <w:rPr>
                   <w:rStyle w:val="Hyperlink"/>
@@ -7343,7 +7432,7 @@
                 <w:lang w:val="en-GB"/>
               </w:rPr>
             </w:pPr>
-            <w:hyperlink r:id="rId23" w:history="1">
+            <w:hyperlink r:id="rId22" w:history="1">
               <w:r>
                 <w:rPr>
                   <w:rStyle w:val="Hyperlink"/>
@@ -7897,6 +7986,7 @@
               </w:rPr>
               <w:t xml:space="preserve"> </w:t>
             </w:r>
+            <w:proofErr w:type="spellStart"/>
             <w:r>
               <w:rPr>
                 <w:rFonts w:ascii="Verdana" w:hAnsi="Verdana" w:cs="Arial"/>
@@ -7906,7 +7996,19 @@
                 <w:u w:val="single"/>
                 <w:lang w:val="en-GB"/>
               </w:rPr>
-              <w:t>GoldenSource EDM</w:t>
+              <w:t>GoldenSource</w:t>
+            </w:r>
+            <w:proofErr w:type="spellEnd"/>
+            <w:r>
+              <w:rPr>
+                <w:rFonts w:ascii="Verdana" w:hAnsi="Verdana" w:cs="Arial"/>
+                <w:bCs/>
+                <w:i/>
+                <w:sz w:val="20"/>
+                <w:u w:val="single"/>
+                <w:lang w:val="en-GB"/>
+              </w:rPr>
+              <w:t xml:space="preserve"> EDM</w:t>
             </w:r>
             <w:r>
               <w:rPr>
@@ -8224,7 +8326,7 @@
                 <w:lang w:val="en-GB"/>
               </w:rPr>
             </w:pPr>
-            <w:hyperlink r:id="rId24" w:history="1">
+            <w:hyperlink r:id="rId23" w:history="1">
               <w:r>
                 <w:rPr>
                   <w:rStyle w:val="Hyperlink"/>
@@ -9148,7 +9250,7 @@
                 <w:lang w:val="en-GB"/>
               </w:rPr>
             </w:pPr>
-            <w:hyperlink r:id="rId25" w:history="1">
+            <w:hyperlink r:id="rId24" w:history="1">
               <w:r>
                 <w:rPr>
                   <w:rStyle w:val="Hyperlink"/>
@@ -9862,7 +9964,7 @@
                 <w:lang w:val="en-GB"/>
               </w:rPr>
             </w:pPr>
-            <w:hyperlink r:id="rId26" w:history="1">
+            <w:hyperlink r:id="rId25" w:history="1">
               <w:r>
                 <w:rPr>
                   <w:rStyle w:val="Hyperlink"/>
@@ -10794,7 +10896,7 @@
                 <w:lang w:val="en-GB"/>
               </w:rPr>
             </w:pPr>
-            <w:hyperlink r:id="rId27" w:history="1">
+            <w:hyperlink r:id="rId26" w:history="1">
               <w:r>
                 <w:rPr>
                   <w:rStyle w:val="Hyperlink"/>
@@ -11796,7 +11898,7 @@
                 <w:lang w:val="en-GB"/>
               </w:rPr>
               <w:lastRenderedPageBreak/>
-              <w:pict w14:anchorId="00F9BD4F">
+              <w:pict w14:anchorId="2BF3EB00">
                 <v:group id="_x0000_s2260" style="position:absolute;margin-left:56.2pt;margin-top:-446.8pt;width:142.2pt;height:16.5pt;z-index:-3;mso-position-horizontal-relative:text;mso-position-vertical-relative:text" coordorigin="1342,3892" coordsize="2700,180" o:allowincell="f">
                   <v:rect id="_x0000_s2261" style="position:absolute;left:1342;top:3892;width:2700;height:180" fillcolor="#31849b" stroked="f">
                     <v:fill opacity="59638f"/>
@@ -11859,7 +11961,7 @@
               </w:rPr>
               <w:t xml:space="preserve">Client Knowledge Limited (now </w:t>
             </w:r>
-            <w:hyperlink r:id="rId28" w:history="1">
+            <w:hyperlink r:id="rId27" w:history="1">
               <w:r>
                 <w:rPr>
                   <w:rStyle w:val="Hyperlink"/>
@@ -12685,7 +12787,7 @@
               </w:rPr>
               <w:t xml:space="preserve">Barclays Global Investors (now </w:t>
             </w:r>
-            <w:hyperlink r:id="rId29" w:history="1">
+            <w:hyperlink r:id="rId28" w:history="1">
               <w:r>
                 <w:rPr>
                   <w:rStyle w:val="Hyperlink"/>
@@ -12980,7 +13082,7 @@
                 <w:lang w:val="en-GB" w:eastAsia="ar-SA"/>
               </w:rPr>
             </w:pPr>
-            <w:hyperlink r:id="rId30" w:history="1">
+            <w:hyperlink r:id="rId29" w:history="1">
               <w:r>
                 <w:rPr>
                   <w:rStyle w:val="Hyperlink"/>
@@ -12999,7 +13101,27 @@
                 <w:sz w:val="20"/>
                 <w:lang w:val="en-GB" w:eastAsia="ar-SA"/>
               </w:rPr>
-              <w:t>, Adastral Park</w:t>
+              <w:t xml:space="preserve">, </w:t>
+            </w:r>
+            <w:proofErr w:type="spellStart"/>
+            <w:r>
+              <w:rPr>
+                <w:rFonts w:ascii="Verdana" w:eastAsia="Calibri" w:hAnsi="Verdana" w:cs="Arial"/>
+                <w:b/>
+                <w:sz w:val="20"/>
+                <w:lang w:val="en-GB" w:eastAsia="ar-SA"/>
+              </w:rPr>
+              <w:t>Adastral</w:t>
+            </w:r>
+            <w:proofErr w:type="spellEnd"/>
+            <w:r>
+              <w:rPr>
+                <w:rFonts w:ascii="Verdana" w:eastAsia="Calibri" w:hAnsi="Verdana" w:cs="Arial"/>
+                <w:b/>
+                <w:sz w:val="20"/>
+                <w:lang w:val="en-GB" w:eastAsia="ar-SA"/>
+              </w:rPr>
+              <w:t xml:space="preserve"> Park</w:t>
             </w:r>
             <w:r>
               <w:rPr>
@@ -13376,7 +13498,7 @@
                 <w:lang w:val="en-GB" w:eastAsia="ar-SA"/>
               </w:rPr>
             </w:pPr>
-            <w:hyperlink r:id="rId31" w:history="1">
+            <w:hyperlink r:id="rId30" w:history="1">
               <w:r>
                 <w:rPr>
                   <w:rStyle w:val="Hyperlink"/>
@@ -13673,12 +13795,12 @@
       </w:pPr>
     </w:p>
     <w:sectPr>
-      <w:headerReference w:type="even" r:id="rId32"/>
-      <w:headerReference w:type="default" r:id="rId33"/>
-      <w:footerReference w:type="even" r:id="rId34"/>
-      <w:footerReference w:type="default" r:id="rId35"/>
-      <w:headerReference w:type="first" r:id="rId36"/>
-      <w:footerReference w:type="first" r:id="rId37"/>
+      <w:headerReference w:type="even" r:id="rId31"/>
+      <w:headerReference w:type="default" r:id="rId32"/>
+      <w:footerReference w:type="even" r:id="rId33"/>
+      <w:footerReference w:type="default" r:id="rId34"/>
+      <w:headerReference w:type="first" r:id="rId35"/>
+      <w:footerReference w:type="first" r:id="rId36"/>
       <w:pgSz w:w="11906" w:h="16838"/>
       <w:pgMar w:top="284" w:right="284" w:bottom="284" w:left="284" w:header="567" w:footer="454" w:gutter="0"/>
       <w:cols w:space="708"/>
@@ -13741,7 +13863,7 @@
         <w:szCs w:val="22"/>
         <w:lang w:val="en-GB" w:eastAsia="ar-SA"/>
       </w:rPr>
-      <w:pict w14:anchorId="4D56512F">
+      <w:pict w14:anchorId="6EB6C181">
         <v:group id="Group 2" o:spid="_x0000_s1028" style="position:absolute;margin-left:526.8pt;margin-top:-.15pt;width:39.7pt;height:17pt;z-index:-1" coordorigin="614,660" coordsize="864,374" wrapcoords="0 -939 -408 1878 -408 19722 0 21600 21192 21600 21600 21600 22008 16904 22008 939 21192 -939 0 -939">
           <v:roundrect id="_x0000_s1029" style="position:absolute;left:859;top:415;width:374;height:864;rotation:-90;visibility:visible" arcsize="10923f" filled="f" strokecolor="#247a00" strokeweight="1pt">
             <v:shadow color="#868686"/>
@@ -17662,52 +17784,52 @@
       </w:rPr>
     </w:lvl>
   </w:abstractNum>
-  <w:num w:numId="1" w16cid:durableId="882638852">
+  <w:num w:numId="1" w16cid:durableId="1098253442">
     <w:abstractNumId w:val="8"/>
   </w:num>
-  <w:num w:numId="2" w16cid:durableId="991906952">
+  <w:num w:numId="2" w16cid:durableId="391854615">
     <w:abstractNumId w:val="26"/>
   </w:num>
-  <w:num w:numId="3" w16cid:durableId="1270815875">
+  <w:num w:numId="3" w16cid:durableId="1409644661">
     <w:abstractNumId w:val="17"/>
   </w:num>
-  <w:num w:numId="4" w16cid:durableId="390813402">
+  <w:num w:numId="4" w16cid:durableId="2064522516">
     <w:abstractNumId w:val="23"/>
   </w:num>
-  <w:num w:numId="5" w16cid:durableId="522472813">
+  <w:num w:numId="5" w16cid:durableId="979312327">
     <w:abstractNumId w:val="7"/>
   </w:num>
-  <w:num w:numId="6" w16cid:durableId="57362567">
+  <w:num w:numId="6" w16cid:durableId="1651981578">
     <w:abstractNumId w:val="24"/>
   </w:num>
-  <w:num w:numId="7" w16cid:durableId="842937837">
+  <w:num w:numId="7" w16cid:durableId="1619022862">
     <w:abstractNumId w:val="27"/>
   </w:num>
-  <w:num w:numId="8" w16cid:durableId="334306467">
+  <w:num w:numId="8" w16cid:durableId="1928345396">
     <w:abstractNumId w:val="19"/>
   </w:num>
-  <w:num w:numId="9" w16cid:durableId="1380789167">
+  <w:num w:numId="9" w16cid:durableId="2142797585">
     <w:abstractNumId w:val="21"/>
   </w:num>
-  <w:num w:numId="10" w16cid:durableId="246505266">
+  <w:num w:numId="10" w16cid:durableId="10647059">
     <w:abstractNumId w:val="0"/>
   </w:num>
-  <w:num w:numId="11" w16cid:durableId="1212571958">
+  <w:num w:numId="11" w16cid:durableId="220293367">
     <w:abstractNumId w:val="25"/>
   </w:num>
-  <w:num w:numId="12" w16cid:durableId="459033775">
+  <w:num w:numId="12" w16cid:durableId="611984869">
     <w:abstractNumId w:val="14"/>
   </w:num>
-  <w:num w:numId="13" w16cid:durableId="688675536">
+  <w:num w:numId="13" w16cid:durableId="237138437">
     <w:abstractNumId w:val="22"/>
   </w:num>
-  <w:num w:numId="14" w16cid:durableId="962686849">
+  <w:num w:numId="14" w16cid:durableId="1865173879">
     <w:abstractNumId w:val="3"/>
   </w:num>
-  <w:num w:numId="15" w16cid:durableId="1998419869">
+  <w:num w:numId="15" w16cid:durableId="1813447768">
     <w:abstractNumId w:val="9"/>
   </w:num>
-  <w:num w:numId="16" w16cid:durableId="284390376">
+  <w:num w:numId="16" w16cid:durableId="1309625614">
     <w:abstractNumId w:val="10"/>
     <w:lvlOverride w:ilvl="0"/>
     <w:lvlOverride w:ilvl="1"/>
@@ -17719,7 +17841,7 @@
     <w:lvlOverride w:ilvl="7"/>
     <w:lvlOverride w:ilvl="8"/>
   </w:num>
-  <w:num w:numId="17" w16cid:durableId="1735471660">
+  <w:num w:numId="17" w16cid:durableId="1237402318">
     <w:abstractNumId w:val="16"/>
     <w:lvlOverride w:ilvl="0"/>
     <w:lvlOverride w:ilvl="1"/>
@@ -17731,37 +17853,37 @@
     <w:lvlOverride w:ilvl="7"/>
     <w:lvlOverride w:ilvl="8"/>
   </w:num>
-  <w:num w:numId="18" w16cid:durableId="1947469277">
+  <w:num w:numId="18" w16cid:durableId="287668196">
     <w:abstractNumId w:val="4"/>
   </w:num>
-  <w:num w:numId="19" w16cid:durableId="734861805">
+  <w:num w:numId="19" w16cid:durableId="832187096">
     <w:abstractNumId w:val="15"/>
   </w:num>
-  <w:num w:numId="20" w16cid:durableId="1510829200">
+  <w:num w:numId="20" w16cid:durableId="1587884412">
     <w:abstractNumId w:val="6"/>
   </w:num>
-  <w:num w:numId="21" w16cid:durableId="789737742">
+  <w:num w:numId="21" w16cid:durableId="521668603">
     <w:abstractNumId w:val="2"/>
   </w:num>
-  <w:num w:numId="22" w16cid:durableId="2022974922">
+  <w:num w:numId="22" w16cid:durableId="1209225734">
     <w:abstractNumId w:val="13"/>
   </w:num>
-  <w:num w:numId="23" w16cid:durableId="1902330405">
+  <w:num w:numId="23" w16cid:durableId="1935892838">
     <w:abstractNumId w:val="5"/>
   </w:num>
-  <w:num w:numId="24" w16cid:durableId="1128158010">
+  <w:num w:numId="24" w16cid:durableId="1613434001">
     <w:abstractNumId w:val="12"/>
   </w:num>
-  <w:num w:numId="25" w16cid:durableId="838886941">
+  <w:num w:numId="25" w16cid:durableId="1129938877">
     <w:abstractNumId w:val="11"/>
   </w:num>
-  <w:num w:numId="26" w16cid:durableId="688605214">
+  <w:num w:numId="26" w16cid:durableId="1346976301">
     <w:abstractNumId w:val="18"/>
   </w:num>
-  <w:num w:numId="27" w16cid:durableId="1622036580">
+  <w:num w:numId="27" w16cid:durableId="241527636">
     <w:abstractNumId w:val="20"/>
   </w:num>
-  <w:num w:numId="28" w16cid:durableId="1292901648">
+  <w:num w:numId="28" w16cid:durableId="1394162934">
     <w:abstractNumId w:val="1"/>
   </w:num>
 </w:numbering>

</xml_diff>

<commit_message>
SEHHACA-225: cv: updated date
</commit_message>
<xml_diff>
--- a/assets/doc/abrar_mudhir_cv.docx
+++ b/assets/doc/abrar_mudhir_cv.docx
@@ -162,7 +162,7 @@
           <w:sz w:val="20"/>
           <w:lang w:val="en-GB" w:eastAsia="en-GB"/>
         </w:rPr>
-        <w:pict w14:anchorId="377FC6B4">
+        <w:pict w14:anchorId="4DCC1728">
           <v:group id="_x0000_s2107" style="position:absolute;margin-left:7.05pt;margin-top:12.05pt;width:138.75pt;height:16.5pt;z-index:-5" coordorigin="1342,3892" coordsize="2700,180" o:allowincell="f">
             <v:rect id="_x0000_s2108" style="position:absolute;left:1342;top:3892;width:2700;height:180" fillcolor="#31849b" stroked="f">
               <v:fill opacity="59638f"/>
@@ -453,7 +453,7 @@
           <w:szCs w:val="16"/>
           <w:lang w:val="en-GB"/>
         </w:rPr>
-        <w:t>5</w:t>
+        <w:t>6</w:t>
       </w:r>
       <w:r>
         <w:rPr>
@@ -625,7 +625,7 @@
           <w:sz w:val="20"/>
           <w:lang w:val="en-GB"/>
         </w:rPr>
-        <w:pict w14:anchorId="3BF6B7B7">
+        <w:pict w14:anchorId="29A1479A">
           <v:group id="_x0000_s2269" style="position:absolute;margin-left:6.8pt;margin-top:131.3pt;width:142.2pt;height:16.5pt;z-index:-1" coordorigin="1342,3892" coordsize="2700,180" o:allowincell="f">
             <v:rect id="_x0000_s2270" style="position:absolute;left:1342;top:3892;width:2700;height:180" fillcolor="#31849b" stroked="f">
               <v:fill opacity="59638f"/>
@@ -644,7 +644,7 @@
           <w:sz w:val="20"/>
           <w:lang w:val="en-GB"/>
         </w:rPr>
-        <w:pict w14:anchorId="02F2B689">
+        <w:pict w14:anchorId="2B44B244">
           <v:group id="_x0000_s2212" style="position:absolute;margin-left:6.8pt;margin-top:12.45pt;width:142.2pt;height:16.5pt;z-index:-4" coordorigin="1342,3892" coordsize="2700,180" o:allowincell="f">
             <v:rect id="_x0000_s2213" style="position:absolute;left:1342;top:3892;width:2700;height:180" fillcolor="#31849b" stroked="f">
               <v:fill opacity="59638f"/>
@@ -1836,7 +1836,7 @@
                 <w:sz w:val="20"/>
                 <w:lang w:val="en-GB" w:eastAsia="ar-SA"/>
               </w:rPr>
-              <w:pict w14:anchorId="34514B16">
+              <w:pict w14:anchorId="0577B3F2">
                 <v:group id="_x0000_s2263" style="position:absolute;margin-left:7.5pt;margin-top:11.85pt;width:142.2pt;height:16.5pt;z-index:-2;mso-position-horizontal-relative:text;mso-position-vertical-relative:text" coordorigin="1342,3892" coordsize="2700,180" o:allowincell="f">
                   <v:rect id="_x0000_s2264" style="position:absolute;left:1342;top:3892;width:2700;height:180" fillcolor="#31849b" stroked="f">
                     <v:fill opacity="59638f"/>
@@ -11793,7 +11793,7 @@
                 <w:sz w:val="20"/>
                 <w:lang w:val="en-GB"/>
               </w:rPr>
-              <w:pict w14:anchorId="2DBA5001">
+              <w:pict w14:anchorId="5C3F0B33">
                 <v:group id="_x0000_s2260" style="position:absolute;margin-left:56.2pt;margin-top:-446.8pt;width:142.2pt;height:16.5pt;z-index:-3;mso-position-horizontal-relative:text;mso-position-vertical-relative:text" coordorigin="1342,3892" coordsize="2700,180" o:allowincell="f">
                   <v:rect id="_x0000_s2261" style="position:absolute;left:1342;top:3892;width:2700;height:180" fillcolor="#31849b" stroked="f">
                     <v:fill opacity="59638f"/>
@@ -13738,7 +13738,7 @@
         <w:szCs w:val="22"/>
         <w:lang w:val="en-GB" w:eastAsia="ar-SA"/>
       </w:rPr>
-      <w:pict w14:anchorId="0A664FC1">
+      <w:pict w14:anchorId="7095FADA">
         <v:group id="Group 2" o:spid="_x0000_s1028" style="position:absolute;margin-left:526.8pt;margin-top:-.15pt;width:39.7pt;height:17pt;z-index:-1" coordorigin="614,660" coordsize="864,374" wrapcoords="0 -939 -408 1878 -408 19722 0 21600 21192 21600 21600 21600 22008 16904 22008 939 21192 -939 0 -939">
           <v:roundrect id="_x0000_s1029" style="position:absolute;left:859;top:415;width:374;height:864;rotation:-90;visibility:visible" arcsize="10923f" filled="f" strokecolor="#247a00" strokeweight="1pt">
             <v:shadow color="#868686"/>
@@ -17659,52 +17659,52 @@
       </w:rPr>
     </w:lvl>
   </w:abstractNum>
-  <w:num w:numId="1" w16cid:durableId="1080297052">
+  <w:num w:numId="1" w16cid:durableId="1425104847">
     <w:abstractNumId w:val="8"/>
   </w:num>
-  <w:num w:numId="2" w16cid:durableId="655035968">
+  <w:num w:numId="2" w16cid:durableId="1172643861">
     <w:abstractNumId w:val="26"/>
   </w:num>
-  <w:num w:numId="3" w16cid:durableId="1443181305">
+  <w:num w:numId="3" w16cid:durableId="161745747">
     <w:abstractNumId w:val="17"/>
   </w:num>
-  <w:num w:numId="4" w16cid:durableId="919288180">
+  <w:num w:numId="4" w16cid:durableId="418870756">
     <w:abstractNumId w:val="23"/>
   </w:num>
-  <w:num w:numId="5" w16cid:durableId="1712340352">
+  <w:num w:numId="5" w16cid:durableId="1866019118">
     <w:abstractNumId w:val="7"/>
   </w:num>
-  <w:num w:numId="6" w16cid:durableId="191265180">
+  <w:num w:numId="6" w16cid:durableId="2008748498">
     <w:abstractNumId w:val="24"/>
   </w:num>
-  <w:num w:numId="7" w16cid:durableId="978656616">
+  <w:num w:numId="7" w16cid:durableId="1557080718">
     <w:abstractNumId w:val="27"/>
   </w:num>
-  <w:num w:numId="8" w16cid:durableId="1463616846">
+  <w:num w:numId="8" w16cid:durableId="1384016246">
     <w:abstractNumId w:val="19"/>
   </w:num>
-  <w:num w:numId="9" w16cid:durableId="1123772851">
+  <w:num w:numId="9" w16cid:durableId="579222086">
     <w:abstractNumId w:val="21"/>
   </w:num>
-  <w:num w:numId="10" w16cid:durableId="1387485289">
+  <w:num w:numId="10" w16cid:durableId="1230505454">
     <w:abstractNumId w:val="0"/>
   </w:num>
-  <w:num w:numId="11" w16cid:durableId="1970546573">
+  <w:num w:numId="11" w16cid:durableId="601912252">
     <w:abstractNumId w:val="25"/>
   </w:num>
-  <w:num w:numId="12" w16cid:durableId="376008263">
+  <w:num w:numId="12" w16cid:durableId="1044524383">
     <w:abstractNumId w:val="14"/>
   </w:num>
-  <w:num w:numId="13" w16cid:durableId="1786734259">
+  <w:num w:numId="13" w16cid:durableId="1596867437">
     <w:abstractNumId w:val="22"/>
   </w:num>
-  <w:num w:numId="14" w16cid:durableId="815806525">
+  <w:num w:numId="14" w16cid:durableId="1556239479">
     <w:abstractNumId w:val="3"/>
   </w:num>
-  <w:num w:numId="15" w16cid:durableId="776485978">
+  <w:num w:numId="15" w16cid:durableId="644748919">
     <w:abstractNumId w:val="9"/>
   </w:num>
-  <w:num w:numId="16" w16cid:durableId="2006938272">
+  <w:num w:numId="16" w16cid:durableId="2130122027">
     <w:abstractNumId w:val="10"/>
     <w:lvlOverride w:ilvl="0"/>
     <w:lvlOverride w:ilvl="1"/>
@@ -17716,7 +17716,7 @@
     <w:lvlOverride w:ilvl="7"/>
     <w:lvlOverride w:ilvl="8"/>
   </w:num>
-  <w:num w:numId="17" w16cid:durableId="853494845">
+  <w:num w:numId="17" w16cid:durableId="1303467161">
     <w:abstractNumId w:val="16"/>
     <w:lvlOverride w:ilvl="0"/>
     <w:lvlOverride w:ilvl="1"/>
@@ -17728,37 +17728,37 @@
     <w:lvlOverride w:ilvl="7"/>
     <w:lvlOverride w:ilvl="8"/>
   </w:num>
-  <w:num w:numId="18" w16cid:durableId="41441776">
+  <w:num w:numId="18" w16cid:durableId="700201535">
     <w:abstractNumId w:val="4"/>
   </w:num>
-  <w:num w:numId="19" w16cid:durableId="592857367">
+  <w:num w:numId="19" w16cid:durableId="1031496143">
     <w:abstractNumId w:val="15"/>
   </w:num>
-  <w:num w:numId="20" w16cid:durableId="790828799">
+  <w:num w:numId="20" w16cid:durableId="274673647">
     <w:abstractNumId w:val="6"/>
   </w:num>
-  <w:num w:numId="21" w16cid:durableId="1508907205">
+  <w:num w:numId="21" w16cid:durableId="711879436">
     <w:abstractNumId w:val="2"/>
   </w:num>
-  <w:num w:numId="22" w16cid:durableId="1726560527">
+  <w:num w:numId="22" w16cid:durableId="130170218">
     <w:abstractNumId w:val="13"/>
   </w:num>
-  <w:num w:numId="23" w16cid:durableId="1074082859">
+  <w:num w:numId="23" w16cid:durableId="1108698869">
     <w:abstractNumId w:val="5"/>
   </w:num>
-  <w:num w:numId="24" w16cid:durableId="635186467">
+  <w:num w:numId="24" w16cid:durableId="32121661">
     <w:abstractNumId w:val="12"/>
   </w:num>
-  <w:num w:numId="25" w16cid:durableId="1404184322">
+  <w:num w:numId="25" w16cid:durableId="403725833">
     <w:abstractNumId w:val="11"/>
   </w:num>
-  <w:num w:numId="26" w16cid:durableId="919682242">
+  <w:num w:numId="26" w16cid:durableId="1522622512">
     <w:abstractNumId w:val="18"/>
   </w:num>
-  <w:num w:numId="27" w16cid:durableId="593055637">
+  <w:num w:numId="27" w16cid:durableId="1753113916">
     <w:abstractNumId w:val="20"/>
   </w:num>
-  <w:num w:numId="28" w16cid:durableId="1116173148">
+  <w:num w:numId="28" w16cid:durableId="1812088080">
     <w:abstractNumId w:val="1"/>
   </w:num>
 </w:numbering>

</xml_diff>